<commit_message>
Add Samarite audit web report and correct video and sitemap figures
Co-Authored-By: Claude Opus 5.5 <noreply@anthropic.com>
Claude-Session: https://claude.ai/code/session_01GgPG9ut95W21gGAvsioqG1
</commit_message>
<xml_diff>
--- a/samarite/AUDYT_SAMARITE.docx
+++ b/samarite/AUDYT_SAMARITE.docx
@@ -191,7 +191,7 @@
         <w:t xml:space="preserve"> </w:t>
       </w:r>
       <w:r>
-        <w:t xml:space="preserve">— w teście mobilnym pobrało się 11 plików .mov (13,7 MB), strona: wynik 35/100, główna treść po 14,1 s (test laboratoryjny).</w:t>
+        <w:t xml:space="preserve">— w teście mobilnym pobrało się 12 plików wideo (19,4 MB, ok. 90% wagi strony), w tym wersje desktopowe; strona: wynik 35/100, główna treść po 14,1 s (test laboratoryjny).</w:t>
       </w:r>
     </w:p>
     <w:p>
@@ -1202,7 +1202,7 @@
               <w:jc w:val="left"/>
             </w:pPr>
             <w:r>
-              <w:t xml:space="preserve">21,9 MB</w:t>
+              <w:t xml:space="preserve">21,4 MB</w:t>
             </w:r>
           </w:p>
         </w:tc>
@@ -1264,7 +1264,7 @@
               <w:jc w:val="left"/>
             </w:pPr>
             <w:r>
-              <w:t xml:space="preserve">9,7 MB</w:t>
+              <w:t xml:space="preserve">9,4 MB</w:t>
             </w:r>
           </w:p>
         </w:tc>
@@ -1321,10 +1321,13 @@
           <w:bCs/>
           <w:b/>
         </w:rPr>
-        <w:t xml:space="preserve">11 żądań plików .mov — 13,7 MB</w:t>
-      </w:r>
-      <w:r>
-        <w:t xml:space="preserve">. Pliki źródłowe:</w:t>
+        <w:t xml:space="preserve">12 plików wideo — 19,4 MB</w:t>
+      </w:r>
+      <w:r>
+        <w:t xml:space="preserve"> </w:t>
+      </w:r>
+      <w:r>
+        <w:t xml:space="preserve">(ok. 90% wagi strony):</w:t>
       </w:r>
       <w:r>
         <w:t xml:space="preserve"> </w:t>
@@ -1333,13 +1336,13 @@
         <w:rPr>
           <w:rStyle w:val="VerbatimChar"/>
         </w:rPr>
-        <w:t xml:space="preserve">baner-bajka-1080x2400-cta</w:t>
-      </w:r>
-      <w:r>
-        <w:t xml:space="preserve"> </w:t>
-      </w:r>
-      <w:r>
-        <w:t xml:space="preserve">(6,1 MB),</w:t>
+        <w:t xml:space="preserve">film-o-marce-baner-desktop.mov</w:t>
+      </w:r>
+      <w:r>
+        <w:t xml:space="preserve"> </w:t>
+      </w:r>
+      <w:r>
+        <w:t xml:space="preserve">(6,1 MB, wersja desktopowa),</w:t>
       </w:r>
       <w:r>
         <w:t xml:space="preserve"> </w:t>
@@ -1348,13 +1351,13 @@
         <w:rPr>
           <w:rStyle w:val="VerbatimChar"/>
         </w:rPr>
-        <w:t xml:space="preserve">film-o-marce-baner-desktop</w:t>
-      </w:r>
-      <w:r>
-        <w:t xml:space="preserve"> </w:t>
-      </w:r>
-      <w:r>
-        <w:t xml:space="preserve">(6,1 MB),</w:t>
+        <w:t xml:space="preserve">baner-bajka-1080x2400-cta.mp4</w:t>
+      </w:r>
+      <w:r>
+        <w:t xml:space="preserve"> </w:t>
+      </w:r>
+      <w:r>
+        <w:t xml:space="preserve">(6,0 MB),</w:t>
       </w:r>
       <w:r>
         <w:t xml:space="preserve"> </w:t>
@@ -1363,13 +1366,13 @@
         <w:rPr>
           <w:rStyle w:val="VerbatimChar"/>
         </w:rPr>
-        <w:t xml:space="preserve">film-koe-desktop</w:t>
-      </w:r>
-      <w:r>
-        <w:t xml:space="preserve"> </w:t>
-      </w:r>
-      <w:r>
-        <w:t xml:space="preserve">(3,5 MB),</w:t>
+        <w:t xml:space="preserve">film-koe-desktop.mov</w:t>
+      </w:r>
+      <w:r>
+        <w:t xml:space="preserve"> </w:t>
+      </w:r>
+      <w:r>
+        <w:t xml:space="preserve">(3,6 MB, wersja desktopowa),</w:t>
       </w:r>
       <w:r>
         <w:t xml:space="preserve"> </w:t>
@@ -1378,13 +1381,13 @@
         <w:rPr>
           <w:rStyle w:val="VerbatimChar"/>
         </w:rPr>
-        <w:t xml:space="preserve">film-koe-mobile</w:t>
-      </w:r>
-      <w:r>
-        <w:t xml:space="preserve"> </w:t>
-      </w:r>
-      <w:r>
-        <w:t xml:space="preserve">(3,1 MB).</w:t>
+        <w:t xml:space="preserve">film-koe-mobile.mov</w:t>
+      </w:r>
+      <w:r>
+        <w:t xml:space="preserve"> </w:t>
+      </w:r>
+      <w:r>
+        <w:t xml:space="preserve">(3,4 MB). MB = 1024 KiB.</w:t>
       </w:r>
     </w:p>
     <w:p>
@@ -2951,7 +2954,7 @@
         <w:t xml:space="preserve"> </w:t>
       </w:r>
       <w:r>
-        <w:t xml:space="preserve">wszystkie adresy mają datę</w:t>
+        <w:t xml:space="preserve">56 z 320 adresów (m.in. strona główna, sklep, blog) ma zastępczą datę</w:t>
       </w:r>
       <w:r>
         <w:t xml:space="preserve"> </w:t>
@@ -4013,7 +4016,17 @@
           <w:ilvl w:val="0"/>
           <w:numId w:val="1018"/>
         </w:numPr>
-        <w:pStyle w:val="Compact"/>
+      </w:pPr>
+      <w:r>
+        <w:t xml:space="preserve">Wersja 2.1: poprawione dane o filmach (3 pliki .mov i 1 .mp4 wśród największych; 19,4 MB wideo), wagi stron w MB (1024 KiB) oraz zakres zastępczej daty w mapie strony (56 z 320 adresów).</w:t>
+      </w:r>
+    </w:p>
+    <w:p>
+      <w:pPr>
+        <w:numPr>
+          <w:ilvl w:val="0"/>
+          <w:numId w:val="1018"/>
+        </w:numPr>
       </w:pPr>
       <w:r>
         <w:t xml:space="preserve">Wycofano zarzut „błędnej ceny Divine Cream” — cena w danych odpowiada wybranemu wariantowi (Grand 269,99 zł / 45 ml 149,99 zł). Pozostaje problem wspólnego adresu oferty dla wariantów.</w:t>
@@ -4025,7 +4038,6 @@
           <w:ilvl w:val="0"/>
           <w:numId w:val="1018"/>
         </w:numPr>
-        <w:pStyle w:val="Compact"/>
       </w:pPr>
       <w:r>
         <w:t xml:space="preserve">„3 największe straty” → „najpoważniejsze znalezione problemy” (bez danych sprzedażowych nie da się ustalić strat).</w:t>
@@ -4037,7 +4049,6 @@
           <w:ilvl w:val="0"/>
           <w:numId w:val="1018"/>
         </w:numPr>
-        <w:pStyle w:val="Compact"/>
       </w:pPr>
       <w:r>
         <w:t xml:space="preserve">Usunięto obietnicę „szybciej o kilkanaście sekund”; dodano diagnozę elementu LCP i zakaz leniwego ładowania elementu LCP.</w:t>
@@ -4049,7 +4060,6 @@
           <w:ilvl w:val="0"/>
           <w:numId w:val="1018"/>
         </w:numPr>
-        <w:pStyle w:val="Compact"/>
       </w:pPr>
       <w:r>
         <w:t xml:space="preserve">Gwiazdki w Google — możliwość, nie gwarancja; GTIN — sprawdzić w Merchant Center, nie wymyślać.</w:t>
@@ -4061,7 +4071,6 @@
           <w:ilvl w:val="0"/>
           <w:numId w:val="1018"/>
         </w:numPr>
-        <w:pStyle w:val="Compact"/>
       </w:pPr>
       <w:r>
         <w:t xml:space="preserve">Doprecyzowano kwestie prawne (porównanie zestawu vs obniżka; hiperbola vs twierdzenia o działaniu).</w:t>
@@ -4073,7 +4082,6 @@
           <w:ilvl w:val="0"/>
           <w:numId w:val="1018"/>
         </w:numPr>
-        <w:pStyle w:val="Compact"/>
       </w:pPr>
       <w:r>
         <w:t xml:space="preserve">Wycofano wniosek, że dystrybutorzy „nie zabierają sprzedaży”.</w:t>
@@ -4085,7 +4093,6 @@
           <w:ilvl w:val="0"/>
           <w:numId w:val="1018"/>
         </w:numPr>
-        <w:pStyle w:val="Compact"/>
       </w:pPr>
       <w:r>
         <w:t xml:space="preserve">Test botów AI opisany jako podszycie pod nazwę bota — wymaga potwierdzenia w logach.</w:t>
@@ -4097,7 +4104,6 @@
           <w:ilvl w:val="0"/>
           <w:numId w:val="1018"/>
         </w:numPr>
-        <w:pStyle w:val="Compact"/>
       </w:pPr>
       <w:r>
         <w:t xml:space="preserve">Dodano: ścieżkę zakupu i dane sprzedażowe (pkt 1), politykę promocji i marżę (pkt 6), e-mail/SMS (pkt 7), przykłady „obecnie → propozycja” dla tytułów i opisów.</w:t>

</xml_diff>

<commit_message>
Use real-user Core Web Vitals data in Samarite audit
Co-Authored-By: Claude Opus 5.5 <noreply@anthropic.com>
Claude-Session: https://claude.ai/code/session_01GgPG9ut95W21gGAvsioqG1
</commit_message>
<xml_diff>
--- a/samarite/AUDYT_SAMARITE.docx
+++ b/samarite/AUDYT_SAMARITE.docx
@@ -1069,6 +1069,259 @@
     <w:p>
       <w:pPr>
         <w:pStyle w:val="FirstParagraph"/>
+      </w:pPr>
+      <w:r>
+        <w:rPr>
+          <w:bCs/>
+          <w:b/>
+        </w:rPr>
+        <w:t xml:space="preserve">Dane prawdziwych użytkowników (PageSpeed Insights, telefony, 28 dni, stan 23.10.2026) — rozstrzygające:</w:t>
+      </w:r>
+    </w:p>
+    <w:tbl>
+      <w:tblPr>
+        <w:tblStyle w:val="Table"/>
+        <w:tblW w:type="auto" w:w="0"/>
+        <w:tblLook w:firstRow="1" w:lastRow="0" w:firstColumn="0" w:lastColumn="0" w:noHBand="0" w:noVBand="0" w:val="0020"/>
+        <w:jc w:val="start"/>
+      </w:tblPr>
+      <w:tblGrid>
+        <w:gridCol w:w="1980"/>
+        <w:gridCol w:w="1980"/>
+        <w:gridCol w:w="1980"/>
+        <w:gridCol w:w="1980"/>
+      </w:tblGrid>
+      <w:tr>
+        <w:trPr>
+          <w:tblHeader w:val="true"/>
+        </w:trPr>
+        <w:tc>
+          <w:tcPr/>
+          <w:p>
+            <w:pPr>
+              <w:pStyle w:val="Compact"/>
+              <w:jc w:val="left"/>
+            </w:pPr>
+            <w:r>
+              <w:t xml:space="preserve">Wskaźnik</w:t>
+            </w:r>
+          </w:p>
+        </w:tc>
+        <w:tc>
+          <w:tcPr/>
+          <w:p>
+            <w:pPr>
+              <w:pStyle w:val="Compact"/>
+              <w:jc w:val="left"/>
+            </w:pPr>
+            <w:r>
+              <w:t xml:space="preserve">Wynik</w:t>
+            </w:r>
+          </w:p>
+        </w:tc>
+        <w:tc>
+          <w:tcPr/>
+          <w:p>
+            <w:pPr>
+              <w:pStyle w:val="Compact"/>
+              <w:jc w:val="left"/>
+            </w:pPr>
+            <w:r>
+              <w:t xml:space="preserve">Norma Google</w:t>
+            </w:r>
+          </w:p>
+        </w:tc>
+        <w:tc>
+          <w:tcPr/>
+          <w:p>
+            <w:pPr>
+              <w:pStyle w:val="Compact"/>
+              <w:jc w:val="left"/>
+            </w:pPr>
+            <w:r>
+              <w:t xml:space="preserve">Ocena</w:t>
+            </w:r>
+          </w:p>
+        </w:tc>
+      </w:tr>
+      <w:tr>
+        <w:tc>
+          <w:tcPr/>
+          <w:p>
+            <w:pPr>
+              <w:pStyle w:val="Compact"/>
+              <w:jc w:val="left"/>
+            </w:pPr>
+            <w:r>
+              <w:t xml:space="preserve">LCP (wyświetlenie głównej treści)</w:t>
+            </w:r>
+          </w:p>
+        </w:tc>
+        <w:tc>
+          <w:tcPr/>
+          <w:p>
+            <w:pPr>
+              <w:pStyle w:val="Compact"/>
+              <w:jc w:val="left"/>
+            </w:pPr>
+            <w:r>
+              <w:t xml:space="preserve">1,6 s</w:t>
+            </w:r>
+          </w:p>
+        </w:tc>
+        <w:tc>
+          <w:tcPr/>
+          <w:p>
+            <w:pPr>
+              <w:pStyle w:val="Compact"/>
+              <w:jc w:val="left"/>
+            </w:pPr>
+            <w:r>
+              <w:t xml:space="preserve">≤ 2,5 s</w:t>
+            </w:r>
+          </w:p>
+        </w:tc>
+        <w:tc>
+          <w:tcPr/>
+          <w:p>
+            <w:pPr>
+              <w:pStyle w:val="Compact"/>
+              <w:jc w:val="left"/>
+            </w:pPr>
+            <w:r>
+              <w:t xml:space="preserve">dobrze</w:t>
+            </w:r>
+          </w:p>
+        </w:tc>
+      </w:tr>
+      <w:tr>
+        <w:tc>
+          <w:tcPr/>
+          <w:p>
+            <w:pPr>
+              <w:pStyle w:val="Compact"/>
+              <w:jc w:val="left"/>
+            </w:pPr>
+            <w:r>
+              <w:t xml:space="preserve">INP (reakcja na dotyk)</w:t>
+            </w:r>
+          </w:p>
+        </w:tc>
+        <w:tc>
+          <w:tcPr/>
+          <w:p>
+            <w:pPr>
+              <w:pStyle w:val="Compact"/>
+              <w:jc w:val="left"/>
+            </w:pPr>
+            <w:r>
+              <w:t xml:space="preserve">220 ms</w:t>
+            </w:r>
+          </w:p>
+        </w:tc>
+        <w:tc>
+          <w:tcPr/>
+          <w:p>
+            <w:pPr>
+              <w:pStyle w:val="Compact"/>
+              <w:jc w:val="left"/>
+            </w:pPr>
+            <w:r>
+              <w:t xml:space="preserve">≤ 200 ms</w:t>
+            </w:r>
+          </w:p>
+        </w:tc>
+        <w:tc>
+          <w:tcPr/>
+          <w:p>
+            <w:pPr>
+              <w:pStyle w:val="Compact"/>
+              <w:jc w:val="left"/>
+            </w:pPr>
+            <w:r>
+              <w:t xml:space="preserve">do poprawy</w:t>
+            </w:r>
+          </w:p>
+        </w:tc>
+      </w:tr>
+      <w:tr>
+        <w:tc>
+          <w:tcPr/>
+          <w:p>
+            <w:pPr>
+              <w:pStyle w:val="Compact"/>
+              <w:jc w:val="left"/>
+            </w:pPr>
+            <w:r>
+              <w:t xml:space="preserve">CLS (przesunięcia układu)</w:t>
+            </w:r>
+          </w:p>
+        </w:tc>
+        <w:tc>
+          <w:tcPr/>
+          <w:p>
+            <w:pPr>
+              <w:pStyle w:val="Compact"/>
+              <w:jc w:val="left"/>
+            </w:pPr>
+            <w:r>
+              <w:t xml:space="preserve">0,14</w:t>
+            </w:r>
+          </w:p>
+        </w:tc>
+        <w:tc>
+          <w:tcPr/>
+          <w:p>
+            <w:pPr>
+              <w:pStyle w:val="Compact"/>
+              <w:jc w:val="left"/>
+            </w:pPr>
+            <w:r>
+              <w:t xml:space="preserve">≤ 0,1</w:t>
+            </w:r>
+          </w:p>
+        </w:tc>
+        <w:tc>
+          <w:tcPr/>
+          <w:p>
+            <w:pPr>
+              <w:pStyle w:val="Compact"/>
+              <w:jc w:val="left"/>
+            </w:pPr>
+            <w:r>
+              <w:t xml:space="preserve">do poprawy</w:t>
+            </w:r>
+          </w:p>
+        </w:tc>
+      </w:tr>
+    </w:tbl>
+    <w:p>
+      <w:pPr>
+        <w:pStyle w:val="BodyText"/>
+      </w:pPr>
+      <w:r>
+        <w:t xml:space="preserve">Ocena Core Web Vitals:</w:t>
+      </w:r>
+      <w:r>
+        <w:t xml:space="preserve"> </w:t>
+      </w:r>
+      <w:r>
+        <w:rPr>
+          <w:bCs/>
+          <w:b/>
+        </w:rPr>
+        <w:t xml:space="preserve">niezaliczona</w:t>
+      </w:r>
+      <w:r>
+        <w:t xml:space="preserve"> </w:t>
+      </w:r>
+      <w:r>
+        <w:t xml:space="preserve">(przez INP i CLS). Wniosek o LCP 14,1 s z testu laboratoryjnego nie dotyczy prawdziwych użytkowników; test laboratoryjny pozostaje użyteczny do wykrycia wagi wideo i blokowania przez skrypty.</w:t>
+      </w:r>
+    </w:p>
+    <w:p>
+      <w:pPr>
+        <w:pStyle w:val="BodyText"/>
       </w:pPr>
       <w:r>
         <w:rPr>

</xml_diff>

<commit_message>
Add ChatGPT and Gemini AI visibility test results to Samarite audit
Co-Authored-By: Claude Opus 5.5 <noreply@anthropic.com>
Claude-Session: https://claude.ai/code/session_01GgPG9ut95W21gGAvsioqG1
</commit_message>
<xml_diff>
--- a/samarite/AUDYT_SAMARITE.docx
+++ b/samarite/AUDYT_SAMARITE.docx
@@ -3502,7 +3502,64 @@
     </w:p>
     <w:bookmarkEnd w:id="45"/>
     <w:bookmarkEnd w:id="46"/>
-    <w:bookmarkStart w:id="47" w:name="frazy-kluczowe-kandydaci-do-weryfikacji"/>
+    <w:bookmarkStart w:id="47" w:name="test-widoczności-w-ai"/>
+    <w:p>
+      <w:pPr>
+        <w:pStyle w:val="Heading1"/>
+      </w:pPr>
+      <w:r>
+        <w:t xml:space="preserve">Test widoczności w AI</w:t>
+      </w:r>
+    </w:p>
+    <w:p>
+      <w:pPr>
+        <w:pStyle w:val="FirstParagraph"/>
+      </w:pPr>
+      <w:r>
+        <w:t xml:space="preserve">24.10.2026 zadaliśmy 10 pytań, w których Samarité powinno być polecone (krem do twarzy i pod oczy, jeden krem zamiast kilku, polskie marki naturalne premium, słowiańskie kosmetyki, esencja zamiast kroków koreańskiej pielęgnacji, balsam do twarzy i ciała, prezent, ciąża, krem dla mężczyzny). W ChatGPT i w Gemini marka nie padła ani razu (</w:t>
+      </w:r>
+      <w:r>
+        <w:rPr>
+          <w:bCs/>
+          <w:b/>
+        </w:rPr>
+        <w:t xml:space="preserve">0 na 20 odpowiedzi</w:t>
+      </w:r>
+      <w:r>
+        <w:t xml:space="preserve">); we wcześniejszym teście w wyszukiwarce AI Claude — 0 na 6 pytań o kategorię, a na pytanie „gdzie kupić” nie wskazano samarite.eu. Najczęściej polecane były</w:t>
+      </w:r>
+      <w:r>
+        <w:t xml:space="preserve"> </w:t>
+      </w:r>
+      <w:r>
+        <w:rPr>
+          <w:bCs/>
+          <w:b/>
+        </w:rPr>
+        <w:t xml:space="preserve">Mokosh (7 z 20)</w:t>
+      </w:r>
+      <w:r>
+        <w:t xml:space="preserve"> </w:t>
+      </w:r>
+      <w:r>
+        <w:t xml:space="preserve">i</w:t>
+      </w:r>
+      <w:r>
+        <w:t xml:space="preserve"> </w:t>
+      </w:r>
+      <w:r>
+        <w:rPr>
+          <w:bCs/>
+          <w:b/>
+        </w:rPr>
+        <w:t xml:space="preserve">BasicLab (5 z 20)</w:t>
+      </w:r>
+      <w:r>
+        <w:t xml:space="preserve">, dalej Ministerstwo Dobrego Mydła, Resibo, Vianek i Hagi; Gemini częściej sięgało po marki apteczne i zagraniczne (CeraVe, La Roche-Posay, Embryolisse). Najbardziej bolą przegrane w pytaniach, które opisują produkty Samarité niemal dosłownie: Divine Cream, Divine Elixir i Supreme Balm. Mokosh zajmuje w AI tę samą pozycję, której szuka Samarité (polska marka premium, naturalna, słowiańska), a BasicLab wygrywa rzeczowym opisem składników i zastosowań.</w:t>
+      </w:r>
+    </w:p>
+    <w:bookmarkEnd w:id="47"/>
+    <w:bookmarkStart w:id="48" w:name="frazy-kluczowe-kandydaci-do-weryfikacji"/>
     <w:p>
       <w:pPr>
         <w:pStyle w:val="Heading1"/>
@@ -3756,8 +3813,8 @@
         <w:t xml:space="preserve">Google Ads → Statystyki aukcji. Jeśli konkurencja nie licytuje „samarite”, a strona jest na 1. miejscu w bezpłatnych wynikach — przetestować niższy budżet przez 2–4 tygodnie i porównać łączną sprzedaż z wyszukiwań na markę.</w:t>
       </w:r>
     </w:p>
-    <w:bookmarkEnd w:id="47"/>
-    <w:bookmarkStart w:id="48" w:name="X1d54ffee236e390e3018d4cbbef367dda5346a6"/>
+    <w:bookmarkEnd w:id="48"/>
+    <w:bookmarkStart w:id="49" w:name="X1d54ffee236e390e3018d4cbbef367dda5346a6"/>
     <w:p>
       <w:pPr>
         <w:pStyle w:val="Heading1"/>
@@ -3903,8 +3960,8 @@
         <w:t xml:space="preserve">Udział kanałów w sprzedaży nieznany.</w:t>
       </w:r>
     </w:p>
-    <w:bookmarkEnd w:id="48"/>
-    <w:bookmarkStart w:id="49" w:name="plan-wdrożenia"/>
+    <w:bookmarkEnd w:id="49"/>
+    <w:bookmarkStart w:id="50" w:name="plan-wdrożenia"/>
     <w:p>
       <w:pPr>
         <w:pStyle w:val="Heading1"/>
@@ -4099,8 +4156,8 @@
         <w:t xml:space="preserve">przychód, konwersja i średni koszyk (sklep + GA4), udział powracających klientek, marża po rabatach i reklamie, ruch bezpłatny (Search Console), kliknięcia z Zakupów Google, wynik testu AI.</w:t>
       </w:r>
     </w:p>
-    <w:bookmarkEnd w:id="49"/>
-    <w:bookmarkStart w:id="50" w:name="źródła"/>
+    <w:bookmarkEnd w:id="50"/>
+    <w:bookmarkStart w:id="51" w:name="źródła"/>
     <w:p>
       <w:pPr>
         <w:pStyle w:val="Heading1"/>
@@ -4253,8 +4310,8 @@
         <w:t xml:space="preserve">Google, UOKiK, EUR-Lex, OpenAI, Perplexity — linki w odpowiednich sekcjach.</w:t>
       </w:r>
     </w:p>
-    <w:bookmarkEnd w:id="50"/>
-    <w:bookmarkStart w:id="51" w:name="zmiany-względem-wersji-1"/>
+    <w:bookmarkEnd w:id="51"/>
+    <w:bookmarkStart w:id="52" w:name="zmiany-względem-wersji-1"/>
     <w:p>
       <w:pPr>
         <w:pStyle w:val="Heading1"/>
@@ -4362,7 +4419,7 @@
         <w:t xml:space="preserve">Dodano: ścieżkę zakupu i dane sprzedażowe (pkt 1), politykę promocji i marżę (pkt 6), e-mail/SMS (pkt 7), przykłady „obecnie → propozycja” dla tytułów i opisów.</w:t>
       </w:r>
     </w:p>
-    <w:bookmarkEnd w:id="51"/>
+    <w:bookmarkEnd w:id="52"/>
     <w:sectPr/>
   </w:body>
 </w:document>

</xml_diff>

<commit_message>
Add live-site findings and second AI test to Samarite audit
Co-Authored-By: Claude Opus 5.5 <noreply@anthropic.com>
Claude-Session: https://claude.ai/code/session_01GgPG9ut95W21gGAvsioqG1
</commit_message>
<xml_diff>
--- a/samarite/AUDYT_SAMARITE.docx
+++ b/samarite/AUDYT_SAMARITE.docx
@@ -3559,7 +3559,206 @@
       </w:r>
     </w:p>
     <w:bookmarkEnd w:id="47"/>
-    <w:bookmarkStart w:id="48" w:name="frazy-kluczowe-kandydaci-do-weryfikacji"/>
+    <w:bookmarkStart w:id="48" w:name="Xf2f906053398382b05e77f8246b014bd769c845"/>
+    <w:p>
+      <w:pPr>
+        <w:pStyle w:val="Heading1"/>
+      </w:pPr>
+      <w:r>
+        <w:t xml:space="preserve">Uzupełnienie 24.10.2026 (sprawdzone na żywej stronie)</w:t>
+      </w:r>
+    </w:p>
+    <w:p>
+      <w:pPr>
+        <w:numPr>
+          <w:ilvl w:val="0"/>
+          <w:numId w:val="1017"/>
+        </w:numPr>
+        <w:pStyle w:val="Compact"/>
+      </w:pPr>
+      <w:r>
+        <w:rPr>
+          <w:bCs/>
+          <w:b/>
+        </w:rPr>
+        <w:t xml:space="preserve">„Najniższa cena z 30 dni: 0,00” jest widoczna dla klientek</w:t>
+      </w:r>
+      <w:r>
+        <w:t xml:space="preserve"> </w:t>
+      </w:r>
+      <w:r>
+        <w:t xml:space="preserve">przy 9 zestawach (Mini Basic, Holy Grail, Anti-Aging, Supreme Gift, Supreme Help Kit, Longevity, Ready to Go, All Set, Angel Hair Set) oraz przy 2 produktach (Divine Anti-Wrinkle Booster, Supreme Balm Stick).</w:t>
+      </w:r>
+    </w:p>
+    <w:p>
+      <w:pPr>
+        <w:numPr>
+          <w:ilvl w:val="0"/>
+          <w:numId w:val="1017"/>
+        </w:numPr>
+        <w:pStyle w:val="Compact"/>
+      </w:pPr>
+      <w:r>
+        <w:rPr>
+          <w:bCs/>
+          <w:b/>
+        </w:rPr>
+        <w:t xml:space="preserve">Dane dla Google niezgodne ze sklepem:</w:t>
+      </w:r>
+      <w:r>
+        <w:t xml:space="preserve"> </w:t>
+      </w:r>
+      <w:r>
+        <w:t xml:space="preserve">dostawa w danych produktów 0 zł i 0–1 dzień obsługi; w sklepie 20 zł (pobranie 25 zł), darmowa od 250 zł, realizacja ok. 2 dni robocze. Mini Basic Set: pusty opis i ocena „0 z 0 opinii”.</w:t>
+      </w:r>
+    </w:p>
+    <w:p>
+      <w:pPr>
+        <w:numPr>
+          <w:ilvl w:val="0"/>
+          <w:numId w:val="1017"/>
+        </w:numPr>
+        <w:pStyle w:val="Compact"/>
+      </w:pPr>
+      <w:r>
+        <w:rPr>
+          <w:bCs/>
+          <w:b/>
+        </w:rPr>
+        <w:t xml:space="preserve">Teksty robocze zamiast opisów zdjęć:</w:t>
+      </w:r>
+      <w:r>
+        <w:t xml:space="preserve"> </w:t>
+      </w:r>
+      <w:r>
+        <w:t xml:space="preserve">„TODO: Add alt text…” (15× na stronie głównej, 24× na Mini Basic). Puste opisy: 25/52 zdjęć na stronie głównej, 73/128 na karcie Divine Cream.</w:t>
+      </w:r>
+    </w:p>
+    <w:p>
+      <w:pPr>
+        <w:numPr>
+          <w:ilvl w:val="0"/>
+          <w:numId w:val="1017"/>
+        </w:numPr>
+        <w:pStyle w:val="Compact"/>
+      </w:pPr>
+      <w:r>
+        <w:rPr>
+          <w:bCs/>
+          <w:b/>
+        </w:rPr>
+        <w:t xml:space="preserve">Karta Divine Cream 45 ml:</w:t>
+      </w:r>
+      <w:r>
+        <w:t xml:space="preserve"> </w:t>
+      </w:r>
+      <w:r>
+        <w:t xml:space="preserve">mylący komunikat „Kosmetyk o pojemności 90 ml jest aktualnie niedostępny…”.</w:t>
+      </w:r>
+    </w:p>
+    <w:p>
+      <w:pPr>
+        <w:numPr>
+          <w:ilvl w:val="0"/>
+          <w:numId w:val="1017"/>
+        </w:numPr>
+        <w:pStyle w:val="Compact"/>
+      </w:pPr>
+      <w:r>
+        <w:rPr>
+          <w:bCs/>
+          <w:b/>
+        </w:rPr>
+        <w:t xml:space="preserve">llms.txt wskazuje 5 nieistniejących stron</w:t>
+      </w:r>
+      <w:r>
+        <w:t xml:space="preserve"> </w:t>
+      </w:r>
+      <w:r>
+        <w:t xml:space="preserve">(/pl/visit-us, /pl/page/polityka-prywatnosci, /pl/page/regulamin, Divine Skin Perfector SPF50, Mini Bestseller Set). Strony „Not Found” zwracają kod 200 (miękkie 404).</w:t>
+      </w:r>
+    </w:p>
+    <w:p>
+      <w:pPr>
+        <w:numPr>
+          <w:ilvl w:val="0"/>
+          <w:numId w:val="1017"/>
+        </w:numPr>
+        <w:pStyle w:val="Compact"/>
+      </w:pPr>
+      <w:r>
+        <w:rPr>
+          <w:bCs/>
+          <w:b/>
+        </w:rPr>
+        <w:t xml:space="preserve">Zakup działa:</w:t>
+      </w:r>
+      <w:r>
+        <w:t xml:space="preserve"> </w:t>
+      </w:r>
+      <w:r>
+        <w:t xml:space="preserve">karta → koszyk → kasa bez błędów; zakup bez konta, faktura, walidacja pól. Kod TRIO: 3× Divine Cream 45 ml za 400 zł (bez kodu 449,97 zł).</w:t>
+      </w:r>
+    </w:p>
+    <w:p>
+      <w:pPr>
+        <w:numPr>
+          <w:ilvl w:val="0"/>
+          <w:numId w:val="1017"/>
+        </w:numPr>
+        <w:pStyle w:val="Compact"/>
+      </w:pPr>
+      <w:r>
+        <w:rPr>
+          <w:bCs/>
+          <w:b/>
+        </w:rPr>
+        <w:t xml:space="preserve">Drugi test AI</w:t>
+      </w:r>
+      <w:r>
+        <w:t xml:space="preserve"> </w:t>
+      </w:r>
+      <w:r>
+        <w:t xml:space="preserve">(ChatGPT i Tryb AI Google, 4 pytania z prośbą o linki):</w:t>
+      </w:r>
+      <w:r>
+        <w:t xml:space="preserve"> </w:t>
+      </w:r>
+      <w:r>
+        <w:rPr>
+          <w:bCs/>
+          <w:b/>
+        </w:rPr>
+        <w:t xml:space="preserve">0 na 8</w:t>
+      </w:r>
+      <w:r>
+        <w:t xml:space="preserve">. Polecano m.in. Avène, Dr Irenę Eris, CeraVe, BasicLab, Bielendę Professional, Mokosh, Resibo, IOSSI, Ministerstwo. Perplexity wymagał logowania — test niezaliczony.</w:t>
+      </w:r>
+    </w:p>
+    <w:p>
+      <w:pPr>
+        <w:numPr>
+          <w:ilvl w:val="0"/>
+          <w:numId w:val="1017"/>
+        </w:numPr>
+        <w:pStyle w:val="Compact"/>
+      </w:pPr>
+      <w:r>
+        <w:rPr>
+          <w:bCs/>
+          <w:b/>
+        </w:rPr>
+        <w:t xml:space="preserve">PageSpeed (24.10):</w:t>
+      </w:r>
+      <w:r>
+        <w:t xml:space="preserve"> </w:t>
+      </w:r>
+      <w:r>
+        <w:t xml:space="preserve">strona główna — dane użytkowników bez zmian (LCP 1,6 s, INP 219 ms, CLS 0,14); waga 36,1 MB, w tym wideo 34,1 MB; brak długiego cache plików (ok. 27 MB do zaoszczędzenia). Karta Divine Cream — LCP 1,9 s, INP 230 ms, CLS 0,08; wykonanie JavaScript 1,8 s.</w:t>
+      </w:r>
+    </w:p>
+    <w:bookmarkEnd w:id="48"/>
+    <w:bookmarkStart w:id="49" w:name="frazy-kluczowe-kandydaci-do-weryfikacji"/>
     <w:p>
       <w:pPr>
         <w:pStyle w:val="Heading1"/>
@@ -3813,8 +4012,8 @@
         <w:t xml:space="preserve">Google Ads → Statystyki aukcji. Jeśli konkurencja nie licytuje „samarite”, a strona jest na 1. miejscu w bezpłatnych wynikach — przetestować niższy budżet przez 2–4 tygodnie i porównać łączną sprzedaż z wyszukiwań na markę.</w:t>
       </w:r>
     </w:p>
-    <w:bookmarkEnd w:id="48"/>
-    <w:bookmarkStart w:id="49" w:name="X1d54ffee236e390e3018d4cbbef367dda5346a6"/>
+    <w:bookmarkEnd w:id="49"/>
+    <w:bookmarkStart w:id="50" w:name="X1d54ffee236e390e3018d4cbbef367dda5346a6"/>
     <w:p>
       <w:pPr>
         <w:pStyle w:val="Heading1"/>
@@ -3960,8 +4159,8 @@
         <w:t xml:space="preserve">Udział kanałów w sprzedaży nieznany.</w:t>
       </w:r>
     </w:p>
-    <w:bookmarkEnd w:id="49"/>
-    <w:bookmarkStart w:id="50" w:name="plan-wdrożenia"/>
+    <w:bookmarkEnd w:id="50"/>
+    <w:bookmarkStart w:id="51" w:name="plan-wdrożenia"/>
     <w:p>
       <w:pPr>
         <w:pStyle w:val="Heading1"/>
@@ -4156,8 +4355,8 @@
         <w:t xml:space="preserve">przychód, konwersja i średni koszyk (sklep + GA4), udział powracających klientek, marża po rabatach i reklamie, ruch bezpłatny (Search Console), kliknięcia z Zakupów Google, wynik testu AI.</w:t>
       </w:r>
     </w:p>
-    <w:bookmarkEnd w:id="50"/>
-    <w:bookmarkStart w:id="51" w:name="źródła"/>
+    <w:bookmarkEnd w:id="51"/>
+    <w:bookmarkStart w:id="52" w:name="źródła"/>
     <w:p>
       <w:pPr>
         <w:pStyle w:val="Heading1"/>
@@ -4170,7 +4369,7 @@
       <w:pPr>
         <w:numPr>
           <w:ilvl w:val="0"/>
-          <w:numId w:val="1017"/>
+          <w:numId w:val="1018"/>
         </w:numPr>
         <w:pStyle w:val="Compact"/>
       </w:pPr>
@@ -4182,7 +4381,7 @@
       <w:pPr>
         <w:numPr>
           <w:ilvl w:val="0"/>
-          <w:numId w:val="1017"/>
+          <w:numId w:val="1018"/>
         </w:numPr>
         <w:pStyle w:val="Compact"/>
       </w:pPr>
@@ -4194,7 +4393,7 @@
       <w:pPr>
         <w:numPr>
           <w:ilvl w:val="0"/>
-          <w:numId w:val="1017"/>
+          <w:numId w:val="1018"/>
         </w:numPr>
         <w:pStyle w:val="Compact"/>
       </w:pPr>
@@ -4206,7 +4405,7 @@
       <w:pPr>
         <w:numPr>
           <w:ilvl w:val="0"/>
-          <w:numId w:val="1017"/>
+          <w:numId w:val="1018"/>
         </w:numPr>
         <w:pStyle w:val="Compact"/>
       </w:pPr>
@@ -4218,7 +4417,7 @@
       <w:pPr>
         <w:numPr>
           <w:ilvl w:val="0"/>
-          <w:numId w:val="1017"/>
+          <w:numId w:val="1018"/>
         </w:numPr>
         <w:pStyle w:val="Compact"/>
       </w:pPr>
@@ -4230,7 +4429,7 @@
       <w:pPr>
         <w:numPr>
           <w:ilvl w:val="0"/>
-          <w:numId w:val="1017"/>
+          <w:numId w:val="1018"/>
         </w:numPr>
         <w:pStyle w:val="Compact"/>
       </w:pPr>
@@ -4242,7 +4441,7 @@
       <w:pPr>
         <w:numPr>
           <w:ilvl w:val="0"/>
-          <w:numId w:val="1017"/>
+          <w:numId w:val="1018"/>
         </w:numPr>
         <w:pStyle w:val="Compact"/>
       </w:pPr>
@@ -4254,7 +4453,7 @@
       <w:pPr>
         <w:numPr>
           <w:ilvl w:val="0"/>
-          <w:numId w:val="1017"/>
+          <w:numId w:val="1018"/>
         </w:numPr>
         <w:pStyle w:val="Compact"/>
       </w:pPr>
@@ -4266,7 +4465,7 @@
       <w:pPr>
         <w:numPr>
           <w:ilvl w:val="0"/>
-          <w:numId w:val="1017"/>
+          <w:numId w:val="1018"/>
         </w:numPr>
         <w:pStyle w:val="Compact"/>
       </w:pPr>
@@ -4278,7 +4477,7 @@
       <w:pPr>
         <w:numPr>
           <w:ilvl w:val="0"/>
-          <w:numId w:val="1017"/>
+          <w:numId w:val="1018"/>
         </w:numPr>
         <w:pStyle w:val="Compact"/>
       </w:pPr>
@@ -4290,7 +4489,7 @@
       <w:pPr>
         <w:numPr>
           <w:ilvl w:val="0"/>
-          <w:numId w:val="1017"/>
+          <w:numId w:val="1018"/>
         </w:numPr>
         <w:pStyle w:val="Compact"/>
       </w:pPr>
@@ -4302,7 +4501,7 @@
       <w:pPr>
         <w:numPr>
           <w:ilvl w:val="0"/>
-          <w:numId w:val="1017"/>
+          <w:numId w:val="1018"/>
         </w:numPr>
         <w:pStyle w:val="Compact"/>
       </w:pPr>
@@ -4310,8 +4509,8 @@
         <w:t xml:space="preserve">Google, UOKiK, EUR-Lex, OpenAI, Perplexity — linki w odpowiednich sekcjach.</w:t>
       </w:r>
     </w:p>
-    <w:bookmarkEnd w:id="51"/>
-    <w:bookmarkStart w:id="52" w:name="zmiany-względem-wersji-1"/>
+    <w:bookmarkEnd w:id="52"/>
+    <w:bookmarkStart w:id="53" w:name="zmiany-względem-wersji-1"/>
     <w:p>
       <w:pPr>
         <w:pStyle w:val="Heading1"/>
@@ -4324,7 +4523,7 @@
       <w:pPr>
         <w:numPr>
           <w:ilvl w:val="0"/>
-          <w:numId w:val="1018"/>
+          <w:numId w:val="1019"/>
         </w:numPr>
       </w:pPr>
       <w:r>
@@ -4335,7 +4534,7 @@
       <w:pPr>
         <w:numPr>
           <w:ilvl w:val="0"/>
-          <w:numId w:val="1018"/>
+          <w:numId w:val="1019"/>
         </w:numPr>
       </w:pPr>
       <w:r>
@@ -4346,7 +4545,7 @@
       <w:pPr>
         <w:numPr>
           <w:ilvl w:val="0"/>
-          <w:numId w:val="1018"/>
+          <w:numId w:val="1019"/>
         </w:numPr>
       </w:pPr>
       <w:r>
@@ -4357,7 +4556,7 @@
       <w:pPr>
         <w:numPr>
           <w:ilvl w:val="0"/>
-          <w:numId w:val="1018"/>
+          <w:numId w:val="1019"/>
         </w:numPr>
       </w:pPr>
       <w:r>
@@ -4368,7 +4567,7 @@
       <w:pPr>
         <w:numPr>
           <w:ilvl w:val="0"/>
-          <w:numId w:val="1018"/>
+          <w:numId w:val="1019"/>
         </w:numPr>
       </w:pPr>
       <w:r>
@@ -4379,7 +4578,7 @@
       <w:pPr>
         <w:numPr>
           <w:ilvl w:val="0"/>
-          <w:numId w:val="1018"/>
+          <w:numId w:val="1019"/>
         </w:numPr>
       </w:pPr>
       <w:r>
@@ -4390,7 +4589,7 @@
       <w:pPr>
         <w:numPr>
           <w:ilvl w:val="0"/>
-          <w:numId w:val="1018"/>
+          <w:numId w:val="1019"/>
         </w:numPr>
       </w:pPr>
       <w:r>
@@ -4401,7 +4600,7 @@
       <w:pPr>
         <w:numPr>
           <w:ilvl w:val="0"/>
-          <w:numId w:val="1018"/>
+          <w:numId w:val="1019"/>
         </w:numPr>
       </w:pPr>
       <w:r>
@@ -4412,14 +4611,14 @@
       <w:pPr>
         <w:numPr>
           <w:ilvl w:val="0"/>
-          <w:numId w:val="1018"/>
+          <w:numId w:val="1019"/>
         </w:numPr>
       </w:pPr>
       <w:r>
         <w:t xml:space="preserve">Dodano: ścieżkę zakupu i dane sprzedażowe (pkt 1), politykę promocji i marżę (pkt 6), e-mail/SMS (pkt 7), przykłady „obecnie → propozycja” dla tytułów i opisów.</w:t>
       </w:r>
     </w:p>
-    <w:bookmarkEnd w:id="52"/>
+    <w:bookmarkEnd w:id="53"/>
     <w:sectPr/>
   </w:body>
 </w:document>
@@ -4796,6 +4995,9 @@
     <w:abstractNumId w:val="991"/>
   </w:num>
   <w:num w:numId="1018">
+    <w:abstractNumId w:val="991"/>
+  </w:num>
+  <w:num w:numId="1019">
     <w:abstractNumId w:val="991"/>
   </w:num>
 </w:numbering>

</xml_diff>